<commit_message>
chore(downloads): regenerate notes DOCX/PDF from the finalized curriculum
624 notes PDFs and 169 DOCX rebuilt so the downloadable packets carry this wave's
corrections — 3-1's tape diagram and double number line, 3-2's unit price, 3-3's
corrected additive-pattern definition, 3-6's conversion factor.

Claude-Session: https://claude.ai/code/session_0121ULN7bR9kfS5dRZSPDEAK
</commit_message>
<xml_diff>
--- a/lessons/1-1/downloads/1-1-notes-teacher.docx
+++ b/lessons/1-1/downloads/1-1-notes-teacher.docx
@@ -366,7 +366,7 @@
           </w:p>
           <w:p>
             <w:pPr>
-              <w:spacing w:after="0"/>
+              <w:spacing w:after="40"/>
             </w:pPr>
             <w:r>
               <w:rPr>
@@ -376,262 +376,29 @@
               <w:t xml:space="preserve">Anyone who uses mathematical thinking — which is everyone, every day.</w:t>
             </w:r>
           </w:p>
-        </w:tc>
-      </w:tr>
-    </w:tbl>
-    <w:tbl>
-      <w:tblPr>
-        <w:tblW w:type="pct" w:w="100%"/>
-        <w:tblBorders>
-          <w:top w:val="none" w:color="FFFFFF" w:sz="0"/>
-          <w:left w:val="none" w:color="FFFFFF" w:sz="0"/>
-          <w:bottom w:val="single" w:color="C7D2DD" w:sz="4"/>
-          <w:right w:val="none" w:color="FFFFFF" w:sz="0"/>
-          <w:insideH w:val="none" w:color="FFFFFF" w:sz="0"/>
-          <w:insideV w:val="none" w:color="FFFFFF" w:sz="0"/>
-        </w:tblBorders>
-      </w:tblPr>
-      <w:tblGrid>
-        <w:gridCol w:w="1800"/>
-        <w:gridCol w:w="7560"/>
-      </w:tblGrid>
-      <w:tr>
-        <w:trPr>
-          <w:cantSplit/>
-        </w:trPr>
-        <w:tc>
-          <w:tcPr>
-            <w:tcW w:type="dxa" w:w="1800"/>
-            <w:tcMar>
-              <w:top w:type="dxa" w:w="100"/>
-              <w:left w:type="dxa" w:w="40"/>
-              <w:bottom w:type="dxa" w:w="100"/>
-              <w:right w:type="dxa" w:w="120"/>
-            </w:tcMar>
-            <w:vAlign w:val="center"/>
-          </w:tcPr>
           <w:p>
             <w:pPr>
               <w:spacing w:after="0"/>
-              <w:jc w:val="center"/>
-            </w:pPr>
-            <w:r>
-              <w:drawing>
-                <wp:inline distT="0" distB="0" distL="0" distR="0">
-                  <wp:extent cx="1047750" cy="790575"/>
-                  <wp:effectExtent t="0" r="0" b="0" l="0"/>
-                  <wp:docPr id="1" name="" descr="" title=""/>
-                  <wp:cNvGraphicFramePr>
-                    <a:graphicFrameLocks xmlns:a="http://schemas.openxmlformats.org/drawingml/2006/main" noChangeAspect="1"/>
-                  </wp:cNvGraphicFramePr>
-                  <a:graphic xmlns:a="http://schemas.openxmlformats.org/drawingml/2006/main">
-                    <a:graphicData uri="http://schemas.openxmlformats.org/drawingml/2006/picture">
-                      <pic:pic xmlns:pic="http://schemas.openxmlformats.org/drawingml/2006/picture">
-                        <pic:nvPicPr>
-                          <pic:cNvPr id="0" name="" descr=""/>
-                          <pic:cNvPicPr>
-                            <a:picLocks noChangeAspect="1" noChangeArrowheads="1"/>
-                          </pic:cNvPicPr>
-                        </pic:nvPicPr>
-                        <pic:blipFill>
-                          <a:blip r:embed="rId9" cstate="none"/>
-                          <a:srcRect/>
-                          <a:stretch>
-                            <a:fillRect/>
-                          </a:stretch>
-                        </pic:blipFill>
-                        <pic:spPr bwMode="auto">
-                          <a:xfrm>
-                            <a:off x="0" y="0"/>
-                            <a:ext cx="1047750" cy="790575"/>
-                          </a:xfrm>
-                          <a:prstGeom prst="rect">
-                            <a:avLst/>
-                          </a:prstGeom>
-                        </pic:spPr>
-                      </pic:pic>
-                    </a:graphicData>
-                  </a:graphic>
-                </wp:inline>
-              </w:drawing>
-            </w:r>
-          </w:p>
-        </w:tc>
-        <w:tc>
-          <w:tcPr>
-            <w:tcW w:type="dxa" w:w="7560"/>
-            <w:tcMar>
-              <w:top w:type="dxa" w:w="100"/>
-              <w:left w:type="dxa" w:w="40"/>
-              <w:bottom w:type="dxa" w:w="100"/>
-              <w:right w:type="dxa" w:w="40"/>
-            </w:tcMar>
-            <w:vAlign w:val="center"/>
-          </w:tcPr>
-          <w:p>
-            <w:pPr>
-              <w:spacing w:after="50"/>
             </w:pPr>
             <w:r>
               <w:rPr>
                 <w:b/>
                 <w:bCs/>
-                <w:color w:val="12355B"/>
-                <w:sz w:val="24"/>
-                <w:szCs w:val="24"/>
+                <w:color w:val="1FA6A2"/>
+                <w:sz w:val="18"/>
+                <w:szCs w:val="18"/>
               </w:rPr>
-              <w:t xml:space="preserve">math story</w:t>
+              <w:t xml:space="preserve">Example:  </w:t>
             </w:r>
             <w:r>
               <w:rPr>
                 <w:i/>
                 <w:iCs/>
                 <w:color w:val="5F6F80"/>
-                <w:sz w:val="19"/>
-                <w:szCs w:val="19"/>
+                <w:sz w:val="18"/>
+                <w:szCs w:val="18"/>
               </w:rPr>
-              <w:t xml:space="preserve">   historia matemática</w:t>
-            </w:r>
-          </w:p>
-          <w:p>
-            <w:pPr>
-              <w:spacing w:after="0"/>
-            </w:pPr>
-            <w:r>
-              <w:rPr>
-                <w:sz w:val="21"/>
-                <w:szCs w:val="21"/>
-              </w:rPr>
-              <w:t xml:space="preserve">Your own history with mathematics — what you have done, felt, and learned so far.</w:t>
-            </w:r>
-          </w:p>
-        </w:tc>
-      </w:tr>
-    </w:tbl>
-    <w:tbl>
-      <w:tblPr>
-        <w:tblW w:type="pct" w:w="100%"/>
-        <w:tblBorders>
-          <w:top w:val="none" w:color="FFFFFF" w:sz="0"/>
-          <w:left w:val="none" w:color="FFFFFF" w:sz="0"/>
-          <w:bottom w:val="single" w:color="C7D2DD" w:sz="4"/>
-          <w:right w:val="none" w:color="FFFFFF" w:sz="0"/>
-          <w:insideH w:val="none" w:color="FFFFFF" w:sz="0"/>
-          <w:insideV w:val="none" w:color="FFFFFF" w:sz="0"/>
-        </w:tblBorders>
-      </w:tblPr>
-      <w:tblGrid>
-        <w:gridCol w:w="1800"/>
-        <w:gridCol w:w="7560"/>
-      </w:tblGrid>
-      <w:tr>
-        <w:trPr>
-          <w:cantSplit/>
-        </w:trPr>
-        <w:tc>
-          <w:tcPr>
-            <w:tcW w:type="dxa" w:w="1800"/>
-            <w:tcMar>
-              <w:top w:type="dxa" w:w="100"/>
-              <w:left w:type="dxa" w:w="40"/>
-              <w:bottom w:type="dxa" w:w="100"/>
-              <w:right w:type="dxa" w:w="120"/>
-            </w:tcMar>
-            <w:vAlign w:val="center"/>
-          </w:tcPr>
-          <w:p>
-            <w:pPr>
-              <w:spacing w:after="0"/>
-              <w:jc w:val="center"/>
-            </w:pPr>
-            <w:r>
-              <w:drawing>
-                <wp:inline distT="0" distB="0" distL="0" distR="0">
-                  <wp:extent cx="1047750" cy="790575"/>
-                  <wp:effectExtent t="0" r="0" b="0" l="0"/>
-                  <wp:docPr id="1" name="" descr="" title=""/>
-                  <wp:cNvGraphicFramePr>
-                    <a:graphicFrameLocks xmlns:a="http://schemas.openxmlformats.org/drawingml/2006/main" noChangeAspect="1"/>
-                  </wp:cNvGraphicFramePr>
-                  <a:graphic xmlns:a="http://schemas.openxmlformats.org/drawingml/2006/main">
-                    <a:graphicData uri="http://schemas.openxmlformats.org/drawingml/2006/picture">
-                      <pic:pic xmlns:pic="http://schemas.openxmlformats.org/drawingml/2006/picture">
-                        <pic:nvPicPr>
-                          <pic:cNvPr id="0" name="" descr=""/>
-                          <pic:cNvPicPr>
-                            <a:picLocks noChangeAspect="1" noChangeArrowheads="1"/>
-                          </pic:cNvPicPr>
-                        </pic:nvPicPr>
-                        <pic:blipFill>
-                          <a:blip r:embed="rId9" cstate="none"/>
-                          <a:srcRect/>
-                          <a:stretch>
-                            <a:fillRect/>
-                          </a:stretch>
-                        </pic:blipFill>
-                        <pic:spPr bwMode="auto">
-                          <a:xfrm>
-                            <a:off x="0" y="0"/>
-                            <a:ext cx="1047750" cy="790575"/>
-                          </a:xfrm>
-                          <a:prstGeom prst="rect">
-                            <a:avLst/>
-                          </a:prstGeom>
-                        </pic:spPr>
-                      </pic:pic>
-                    </a:graphicData>
-                  </a:graphic>
-                </wp:inline>
-              </w:drawing>
-            </w:r>
-          </w:p>
-        </w:tc>
-        <w:tc>
-          <w:tcPr>
-            <w:tcW w:type="dxa" w:w="7560"/>
-            <w:tcMar>
-              <w:top w:type="dxa" w:w="100"/>
-              <w:left w:type="dxa" w:w="40"/>
-              <w:bottom w:type="dxa" w:w="100"/>
-              <w:right w:type="dxa" w:w="40"/>
-            </w:tcMar>
-            <w:vAlign w:val="center"/>
-          </w:tcPr>
-          <w:p>
-            <w:pPr>
-              <w:spacing w:after="50"/>
-            </w:pPr>
-            <w:r>
-              <w:rPr>
-                <w:b/>
-                <w:bCs/>
-                <w:color w:val="12355B"/>
-                <w:sz w:val="24"/>
-                <w:szCs w:val="24"/>
-              </w:rPr>
-              <w:t xml:space="preserve">strength</w:t>
-            </w:r>
-            <w:r>
-              <w:rPr>
-                <w:i/>
-                <w:iCs/>
-                <w:color w:val="5F6F80"/>
-                <w:sz w:val="19"/>
-                <w:szCs w:val="19"/>
-              </w:rPr>
-              <w:t xml:space="preserve">   fortaleza</w:t>
-            </w:r>
-          </w:p>
-          <w:p>
-            <w:pPr>
-              <w:spacing w:after="0"/>
-            </w:pPr>
-            <w:r>
-              <w:rPr>
-                <w:sz w:val="21"/>
-                <w:szCs w:val="21"/>
-              </w:rPr>
-              <w:t xml:space="preserve">Something you already do well and can share with others.</w:t>
+              <w:t xml:space="preserve">Splitting a bill 4 ways at dinner — that is a doer of math.</w:t>
             </w:r>
           </w:p>
         </w:tc>
@@ -738,7 +505,7 @@
                 <w:sz w:val="24"/>
                 <w:szCs w:val="24"/>
               </w:rPr>
-              <w:t xml:space="preserve">decompose</w:t>
+              <w:t xml:space="preserve">math story</w:t>
             </w:r>
             <w:r>
               <w:rPr>
@@ -748,19 +515,44 @@
                 <w:sz w:val="19"/>
                 <w:szCs w:val="19"/>
               </w:rPr>
-              <w:t xml:space="preserve">   descomponer</w:t>
-            </w:r>
-          </w:p>
-          <w:p>
-            <w:pPr>
-              <w:spacing w:after="0"/>
+              <w:t xml:space="preserve">   historia matemática</w:t>
+            </w:r>
+          </w:p>
+          <w:p>
+            <w:pPr>
+              <w:spacing w:after="40"/>
             </w:pPr>
             <w:r>
               <w:rPr>
                 <w:sz w:val="21"/>
                 <w:szCs w:val="21"/>
               </w:rPr>
-              <w:t xml:space="preserve">To break a number into parts that add, subtract, multiply, or divide back to it.</w:t>
+              <w:t xml:space="preserve">Your own history with mathematics — what you have done, felt, and learned so far.</w:t>
+            </w:r>
+          </w:p>
+          <w:p>
+            <w:pPr>
+              <w:spacing w:after="0"/>
+            </w:pPr>
+            <w:r>
+              <w:rPr>
+                <w:b/>
+                <w:bCs/>
+                <w:color w:val="1FA6A2"/>
+                <w:sz w:val="18"/>
+                <w:szCs w:val="18"/>
+              </w:rPr>
+              <w:t xml:space="preserve">Example:  </w:t>
+            </w:r>
+            <w:r>
+              <w:rPr>
+                <w:i/>
+                <w:iCs/>
+                <w:color w:val="5F6F80"/>
+                <w:sz w:val="18"/>
+                <w:szCs w:val="18"/>
+              </w:rPr>
+              <w:t xml:space="preserve">“In 3rd grade I hated fractions; this year I can explain them.”</w:t>
             </w:r>
           </w:p>
         </w:tc>
@@ -867,6 +659,314 @@
                 <w:sz w:val="24"/>
                 <w:szCs w:val="24"/>
               </w:rPr>
+              <w:t xml:space="preserve">strength</w:t>
+            </w:r>
+            <w:r>
+              <w:rPr>
+                <w:i/>
+                <w:iCs/>
+                <w:color w:val="5F6F80"/>
+                <w:sz w:val="19"/>
+                <w:szCs w:val="19"/>
+              </w:rPr>
+              <w:t xml:space="preserve">   fortaleza</w:t>
+            </w:r>
+          </w:p>
+          <w:p>
+            <w:pPr>
+              <w:spacing w:after="40"/>
+            </w:pPr>
+            <w:r>
+              <w:rPr>
+                <w:sz w:val="21"/>
+                <w:szCs w:val="21"/>
+              </w:rPr>
+              <w:t xml:space="preserve">Something you already do well and can share with others.</w:t>
+            </w:r>
+          </w:p>
+          <w:p>
+            <w:pPr>
+              <w:spacing w:after="0"/>
+            </w:pPr>
+            <w:r>
+              <w:rPr>
+                <w:b/>
+                <w:bCs/>
+                <w:color w:val="1FA6A2"/>
+                <w:sz w:val="18"/>
+                <w:szCs w:val="18"/>
+              </w:rPr>
+              <w:t xml:space="preserve">Example:  </w:t>
+            </w:r>
+            <w:r>
+              <w:rPr>
+                <w:i/>
+                <w:iCs/>
+                <w:color w:val="5F6F80"/>
+                <w:sz w:val="18"/>
+                <w:szCs w:val="18"/>
+              </w:rPr>
+              <w:t xml:space="preserve">“I am good at mental math with money” — a strength you can teach.</w:t>
+            </w:r>
+          </w:p>
+        </w:tc>
+      </w:tr>
+    </w:tbl>
+    <w:tbl>
+      <w:tblPr>
+        <w:tblW w:type="pct" w:w="100%"/>
+        <w:tblBorders>
+          <w:top w:val="none" w:color="FFFFFF" w:sz="0"/>
+          <w:left w:val="none" w:color="FFFFFF" w:sz="0"/>
+          <w:bottom w:val="single" w:color="C7D2DD" w:sz="4"/>
+          <w:right w:val="none" w:color="FFFFFF" w:sz="0"/>
+          <w:insideH w:val="none" w:color="FFFFFF" w:sz="0"/>
+          <w:insideV w:val="none" w:color="FFFFFF" w:sz="0"/>
+        </w:tblBorders>
+      </w:tblPr>
+      <w:tblGrid>
+        <w:gridCol w:w="1800"/>
+        <w:gridCol w:w="7560"/>
+      </w:tblGrid>
+      <w:tr>
+        <w:trPr>
+          <w:cantSplit/>
+        </w:trPr>
+        <w:tc>
+          <w:tcPr>
+            <w:tcW w:type="dxa" w:w="1800"/>
+            <w:tcMar>
+              <w:top w:type="dxa" w:w="100"/>
+              <w:left w:type="dxa" w:w="40"/>
+              <w:bottom w:type="dxa" w:w="100"/>
+              <w:right w:type="dxa" w:w="120"/>
+            </w:tcMar>
+            <w:vAlign w:val="center"/>
+          </w:tcPr>
+          <w:p>
+            <w:pPr>
+              <w:spacing w:after="0"/>
+              <w:jc w:val="center"/>
+            </w:pPr>
+            <w:r>
+              <w:drawing>
+                <wp:inline distT="0" distB="0" distL="0" distR="0">
+                  <wp:extent cx="1047750" cy="790575"/>
+                  <wp:effectExtent t="0" r="0" b="0" l="0"/>
+                  <wp:docPr id="1" name="" descr="" title=""/>
+                  <wp:cNvGraphicFramePr>
+                    <a:graphicFrameLocks xmlns:a="http://schemas.openxmlformats.org/drawingml/2006/main" noChangeAspect="1"/>
+                  </wp:cNvGraphicFramePr>
+                  <a:graphic xmlns:a="http://schemas.openxmlformats.org/drawingml/2006/main">
+                    <a:graphicData uri="http://schemas.openxmlformats.org/drawingml/2006/picture">
+                      <pic:pic xmlns:pic="http://schemas.openxmlformats.org/drawingml/2006/picture">
+                        <pic:nvPicPr>
+                          <pic:cNvPr id="0" name="" descr=""/>
+                          <pic:cNvPicPr>
+                            <a:picLocks noChangeAspect="1" noChangeArrowheads="1"/>
+                          </pic:cNvPicPr>
+                        </pic:nvPicPr>
+                        <pic:blipFill>
+                          <a:blip r:embed="rId12" cstate="none"/>
+                          <a:srcRect/>
+                          <a:stretch>
+                            <a:fillRect/>
+                          </a:stretch>
+                        </pic:blipFill>
+                        <pic:spPr bwMode="auto">
+                          <a:xfrm>
+                            <a:off x="0" y="0"/>
+                            <a:ext cx="1047750" cy="790575"/>
+                          </a:xfrm>
+                          <a:prstGeom prst="rect">
+                            <a:avLst/>
+                          </a:prstGeom>
+                        </pic:spPr>
+                      </pic:pic>
+                    </a:graphicData>
+                  </a:graphic>
+                </wp:inline>
+              </w:drawing>
+            </w:r>
+          </w:p>
+        </w:tc>
+        <w:tc>
+          <w:tcPr>
+            <w:tcW w:type="dxa" w:w="7560"/>
+            <w:tcMar>
+              <w:top w:type="dxa" w:w="100"/>
+              <w:left w:type="dxa" w:w="40"/>
+              <w:bottom w:type="dxa" w:w="100"/>
+              <w:right w:type="dxa" w:w="40"/>
+            </w:tcMar>
+            <w:vAlign w:val="center"/>
+          </w:tcPr>
+          <w:p>
+            <w:pPr>
+              <w:spacing w:after="50"/>
+            </w:pPr>
+            <w:r>
+              <w:rPr>
+                <w:b/>
+                <w:bCs/>
+                <w:color w:val="12355B"/>
+                <w:sz w:val="24"/>
+                <w:szCs w:val="24"/>
+              </w:rPr>
+              <w:t xml:space="preserve">decompose</w:t>
+            </w:r>
+            <w:r>
+              <w:rPr>
+                <w:i/>
+                <w:iCs/>
+                <w:color w:val="5F6F80"/>
+                <w:sz w:val="19"/>
+                <w:szCs w:val="19"/>
+              </w:rPr>
+              <w:t xml:space="preserve">   descomponer</w:t>
+            </w:r>
+          </w:p>
+          <w:p>
+            <w:pPr>
+              <w:spacing w:after="40"/>
+            </w:pPr>
+            <w:r>
+              <w:rPr>
+                <w:sz w:val="21"/>
+                <w:szCs w:val="21"/>
+              </w:rPr>
+              <w:t xml:space="preserve">To break a number into parts that add, subtract, multiply, or divide back to it.</w:t>
+            </w:r>
+          </w:p>
+          <w:p>
+            <w:pPr>
+              <w:spacing w:after="0"/>
+            </w:pPr>
+            <w:r>
+              <w:rPr>
+                <w:b/>
+                <w:bCs/>
+                <w:color w:val="1FA6A2"/>
+                <w:sz w:val="18"/>
+                <w:szCs w:val="18"/>
+              </w:rPr>
+              <w:t xml:space="preserve">Example:  </w:t>
+            </w:r>
+            <w:r>
+              <w:rPr>
+                <w:i/>
+                <w:iCs/>
+                <w:color w:val="5F6F80"/>
+                <w:sz w:val="18"/>
+                <w:szCs w:val="18"/>
+              </w:rPr>
+              <w:t xml:space="preserve">78.5 = 70 + 8.5, and also 157 ÷ 2 — both rebuild the same number.</w:t>
+            </w:r>
+          </w:p>
+        </w:tc>
+      </w:tr>
+    </w:tbl>
+    <w:tbl>
+      <w:tblPr>
+        <w:tblW w:type="pct" w:w="100%"/>
+        <w:tblBorders>
+          <w:top w:val="none" w:color="FFFFFF" w:sz="0"/>
+          <w:left w:val="none" w:color="FFFFFF" w:sz="0"/>
+          <w:bottom w:val="single" w:color="C7D2DD" w:sz="4"/>
+          <w:right w:val="none" w:color="FFFFFF" w:sz="0"/>
+          <w:insideH w:val="none" w:color="FFFFFF" w:sz="0"/>
+          <w:insideV w:val="none" w:color="FFFFFF" w:sz="0"/>
+        </w:tblBorders>
+      </w:tblPr>
+      <w:tblGrid>
+        <w:gridCol w:w="1800"/>
+        <w:gridCol w:w="7560"/>
+      </w:tblGrid>
+      <w:tr>
+        <w:trPr>
+          <w:cantSplit/>
+        </w:trPr>
+        <w:tc>
+          <w:tcPr>
+            <w:tcW w:type="dxa" w:w="1800"/>
+            <w:tcMar>
+              <w:top w:type="dxa" w:w="100"/>
+              <w:left w:type="dxa" w:w="40"/>
+              <w:bottom w:type="dxa" w:w="100"/>
+              <w:right w:type="dxa" w:w="120"/>
+            </w:tcMar>
+            <w:vAlign w:val="center"/>
+          </w:tcPr>
+          <w:p>
+            <w:pPr>
+              <w:spacing w:after="0"/>
+              <w:jc w:val="center"/>
+            </w:pPr>
+            <w:r>
+              <w:drawing>
+                <wp:inline distT="0" distB="0" distL="0" distR="0">
+                  <wp:extent cx="1047750" cy="790575"/>
+                  <wp:effectExtent t="0" r="0" b="0" l="0"/>
+                  <wp:docPr id="1" name="" descr="" title=""/>
+                  <wp:cNvGraphicFramePr>
+                    <a:graphicFrameLocks xmlns:a="http://schemas.openxmlformats.org/drawingml/2006/main" noChangeAspect="1"/>
+                  </wp:cNvGraphicFramePr>
+                  <a:graphic xmlns:a="http://schemas.openxmlformats.org/drawingml/2006/main">
+                    <a:graphicData uri="http://schemas.openxmlformats.org/drawingml/2006/picture">
+                      <pic:pic xmlns:pic="http://schemas.openxmlformats.org/drawingml/2006/picture">
+                        <pic:nvPicPr>
+                          <pic:cNvPr id="0" name="" descr=""/>
+                          <pic:cNvPicPr>
+                            <a:picLocks noChangeAspect="1" noChangeArrowheads="1"/>
+                          </pic:cNvPicPr>
+                        </pic:nvPicPr>
+                        <pic:blipFill>
+                          <a:blip r:embed="rId13" cstate="none"/>
+                          <a:srcRect/>
+                          <a:stretch>
+                            <a:fillRect/>
+                          </a:stretch>
+                        </pic:blipFill>
+                        <pic:spPr bwMode="auto">
+                          <a:xfrm>
+                            <a:off x="0" y="0"/>
+                            <a:ext cx="1047750" cy="790575"/>
+                          </a:xfrm>
+                          <a:prstGeom prst="rect">
+                            <a:avLst/>
+                          </a:prstGeom>
+                        </pic:spPr>
+                      </pic:pic>
+                    </a:graphicData>
+                  </a:graphic>
+                </wp:inline>
+              </w:drawing>
+            </w:r>
+          </w:p>
+        </w:tc>
+        <w:tc>
+          <w:tcPr>
+            <w:tcW w:type="dxa" w:w="7560"/>
+            <w:tcMar>
+              <w:top w:type="dxa" w:w="100"/>
+              <w:left w:type="dxa" w:w="40"/>
+              <w:bottom w:type="dxa" w:w="100"/>
+              <w:right w:type="dxa" w:w="40"/>
+            </w:tcMar>
+            <w:vAlign w:val="center"/>
+          </w:tcPr>
+          <w:p>
+            <w:pPr>
+              <w:spacing w:after="50"/>
+            </w:pPr>
+            <w:r>
+              <w:rPr>
+                <w:b/>
+                <w:bCs/>
+                <w:color w:val="12355B"/>
+                <w:sz w:val="24"/>
+                <w:szCs w:val="24"/>
+              </w:rPr>
               <w:t xml:space="preserve">estimate</w:t>
             </w:r>
             <w:r>
@@ -882,7 +982,7 @@
           </w:p>
           <w:p>
             <w:pPr>
-              <w:spacing w:after="0"/>
+              <w:spacing w:after="40"/>
             </w:pPr>
             <w:r>
               <w:rPr>
@@ -890,6 +990,31 @@
                 <w:szCs w:val="21"/>
               </w:rPr>
               <w:t xml:space="preserve">A reasoned answer that is close enough to be useful, without counting every one.</w:t>
+            </w:r>
+          </w:p>
+          <w:p>
+            <w:pPr>
+              <w:spacing w:after="0"/>
+            </w:pPr>
+            <w:r>
+              <w:rPr>
+                <w:b/>
+                <w:bCs/>
+                <w:color w:val="1FA6A2"/>
+                <w:sz w:val="18"/>
+                <w:szCs w:val="18"/>
+              </w:rPr>
+              <w:t xml:space="preserve">Example:  </w:t>
+            </w:r>
+            <w:r>
+              <w:rPr>
+                <w:i/>
+                <w:iCs/>
+                <w:color w:val="5F6F80"/>
+                <w:sz w:val="18"/>
+                <w:szCs w:val="18"/>
+              </w:rPr>
+              <w:t xml:space="preserve">20 cars × about 4 riders ≈ 80 people on the Ferris wheel.</w:t>
             </w:r>
           </w:p>
         </w:tc>
@@ -1014,7 +1139,7 @@
           <w:sz w:val="22"/>
           <w:szCs w:val="22"/>
         </w:rPr>
-        <w:t xml:space="preserve">__________  —  Anyone who uses mathematical thinking — which is everyone, every day.</w:t>
+        <w:t xml:space="preserve">Anyone who uses mathematical thinking is a ___ ___ ___.</w:t>
       </w:r>
     </w:p>
     <w:p>
@@ -1036,7 +1161,7 @@
           <w:sz w:val="22"/>
           <w:szCs w:val="22"/>
         </w:rPr>
-        <w:t xml:space="preserve">__________  —  Your own history with mathematics — what you have done, felt, and learned so far.</w:t>
+        <w:t xml:space="preserve">Your history with mathematics — what you have done and felt — is your ___ ___.</w:t>
       </w:r>
     </w:p>
     <w:p>
@@ -1058,7 +1183,7 @@
           <w:sz w:val="22"/>
           <w:szCs w:val="22"/>
         </w:rPr>
-        <w:t xml:space="preserve">__________  —  Something you already do well and can share with others.</w:t>
+        <w:t xml:space="preserve">Something you already do well and can share with others is a ___.</w:t>
       </w:r>
     </w:p>
     <w:p>
@@ -1080,7 +1205,7 @@
           <w:sz w:val="22"/>
           <w:szCs w:val="22"/>
         </w:rPr>
-        <w:t xml:space="preserve">__________  —  To break a number into parts that add, subtract, multiply, or divide back to it.</w:t>
+        <w:t xml:space="preserve">To break a number into parts that rebuild it exactly is to ___ it.</w:t>
       </w:r>
     </w:p>
     <w:p>
@@ -1102,7 +1227,7 @@
           <w:sz w:val="22"/>
           <w:szCs w:val="22"/>
         </w:rPr>
-        <w:t xml:space="preserve">__________  —  A reasoned answer that is close enough to be useful, without counting every one.</w:t>
+        <w:t xml:space="preserve">A reasoned answer that is close enough to be useful is an ___.</w:t>
       </w:r>
     </w:p>
     <w:p>
@@ -2486,7 +2611,7 @@
                 <w:sz w:val="21"/>
                 <w:szCs w:val="21"/>
               </w:rPr>
-              <w:t xml:space="preserve">You have been doing math your whole life — at home, in school, and in your neighborhood — often without calling it math. This year starts by naming what you already do.</w:t>
+              <w:t xml:space="preserve">You have been doing math your whole life — at home, in school, and in your neighborhood — often without calling it math. This year starts by naming what you already do. Today you will take a Strengths Inventory — naming one thing you can already do well and one area you want to grow — and you will write your own math story. Then you will read a classmate’s story and find one thing that is the same as yours and one thing that is different. Estimating the riders on that Ferris wheel is math. So is deciding whether an answer is reasonable.</w:t>
             </w:r>
           </w:p>
         </w:tc>

</xml_diff>